<commit_message>
Design updates to choropleth
Some tweaking of scale bars and presentation
</commit_message>
<xml_diff>
--- a/Outputs/Project Report.docx
+++ b/Outputs/Project Report.docx
@@ -77,7 +77,6 @@
       <w:r>
         <w:t xml:space="preserve">Variable naming very important, took way too long working with errors on a choropleth map because I named variables </w:t>
       </w:r>
-      <w:proofErr w:type="spellStart"/>
       <w:r>
         <w:rPr>
           <w:i/>
@@ -85,11 +84,9 @@
         </w:rPr>
         <w:t>modis_count</w:t>
       </w:r>
-      <w:proofErr w:type="spellEnd"/>
       <w:r>
         <w:t xml:space="preserve"> and </w:t>
       </w:r>
-      <w:proofErr w:type="spellStart"/>
       <w:r>
         <w:rPr>
           <w:i/>
@@ -97,7 +94,6 @@
         </w:rPr>
         <w:t>modis_counts</w:t>
       </w:r>
-      <w:proofErr w:type="spellEnd"/>
     </w:p>
     <w:p>
       <w:pPr>
@@ -111,15 +107,7 @@
         <w:t xml:space="preserve">Size of included data </w:t>
       </w:r>
       <w:r>
-        <w:t>can really slow down project, LGA .</w:t>
-      </w:r>
-      <w:proofErr w:type="spellStart"/>
-      <w:r>
-        <w:t>gpkg</w:t>
-      </w:r>
-      <w:proofErr w:type="spellEnd"/>
-      <w:r>
-        <w:t xml:space="preserve"> was very hard to work with</w:t>
+        <w:t>can really slow down project, LGA .gpkg was very hard to work with</w:t>
       </w:r>
     </w:p>
     <w:p>
@@ -147,10 +135,48 @@
       </w:pPr>
     </w:p>
     <w:p/>
-    <w:p/>
+    <w:p>
+      <w:r>
+        <w:drawing>
+          <wp:inline distT="0" distB="0" distL="0" distR="0" wp14:anchorId="03A36834" wp14:editId="2EE13955">
+            <wp:extent cx="5706271" cy="724001"/>
+            <wp:effectExtent l="0" t="0" r="8890" b="0"/>
+            <wp:docPr id="1985552084" name="Picture 1"/>
+            <wp:cNvGraphicFramePr>
+              <a:graphicFrameLocks xmlns:a="http://schemas.openxmlformats.org/drawingml/2006/main" noChangeAspect="1"/>
+            </wp:cNvGraphicFramePr>
+            <a:graphic xmlns:a="http://schemas.openxmlformats.org/drawingml/2006/main">
+              <a:graphicData uri="http://schemas.openxmlformats.org/drawingml/2006/picture">
+                <pic:pic xmlns:pic="http://schemas.openxmlformats.org/drawingml/2006/picture">
+                  <pic:nvPicPr>
+                    <pic:cNvPr id="1985552084" name=""/>
+                    <pic:cNvPicPr/>
+                  </pic:nvPicPr>
+                  <pic:blipFill>
+                    <a:blip r:embed="rId7"/>
+                    <a:stretch>
+                      <a:fillRect/>
+                    </a:stretch>
+                  </pic:blipFill>
+                  <pic:spPr>
+                    <a:xfrm>
+                      <a:off x="0" y="0"/>
+                      <a:ext cx="5706271" cy="724001"/>
+                    </a:xfrm>
+                    <a:prstGeom prst="rect">
+                      <a:avLst/>
+                    </a:prstGeom>
+                  </pic:spPr>
+                </pic:pic>
+              </a:graphicData>
+            </a:graphic>
+          </wp:inline>
+        </w:drawing>
+      </w:r>
+    </w:p>
     <w:p/>
     <w:p>
-      <w:hyperlink r:id="rId7" w:history="1">
+      <w:hyperlink r:id="rId8" w:history="1">
         <w:r>
           <w:rPr>
             <w:rStyle w:val="Hyperlink"/>

</xml_diff>

<commit_message>
Moved outputs into Outputs folder
</commit_message>
<xml_diff>
--- a/Outputs/Project Report.docx
+++ b/Outputs/Project Report.docx
@@ -149,6 +149,9 @@
     <w:p/>
     <w:p>
       <w:r>
+        <w:rPr>
+          <w:noProof/>
+        </w:rPr>
         <w:drawing>
           <wp:inline distT="0" distB="0" distL="0" distR="0" wp14:anchorId="03A36834" wp14:editId="2EE13955">
             <wp:extent cx="5706271" cy="724001"/>
@@ -219,6 +222,118 @@
         </w:r>
       </w:hyperlink>
     </w:p>
+    <w:p/>
+    <w:p/>
+    <w:p>
+      <w:pPr>
+        <w:numPr>
+          <w:ilvl w:val="0"/>
+          <w:numId w:val="2"/>
+        </w:numPr>
+      </w:pPr>
+      <w:r>
+        <w:rPr>
+          <w:b/>
+          <w:bCs/>
+        </w:rPr>
+        <w:t>Introduction:</w:t>
+      </w:r>
+      <w:r>
+        <w:t xml:space="preserve"> Briefly explain your chosen project topic, the specific spatial question you are answering, and the </w:t>
+      </w:r>
+      <w:proofErr w:type="gramStart"/>
+      <w:r>
+        <w:t>ultimate aim</w:t>
+      </w:r>
+      <w:proofErr w:type="gramEnd"/>
+      <w:r>
+        <w:t xml:space="preserve"> of the analysis.</w:t>
+      </w:r>
+    </w:p>
+    <w:p>
+      <w:pPr>
+        <w:numPr>
+          <w:ilvl w:val="0"/>
+          <w:numId w:val="2"/>
+        </w:numPr>
+      </w:pPr>
+      <w:r>
+        <w:rPr>
+          <w:b/>
+          <w:bCs/>
+        </w:rPr>
+        <w:t>Workflow and Implementation:</w:t>
+      </w:r>
+      <w:r>
+        <w:t> Summarize the logical steps of your workflow. Focus on your overarching approach to data cleaning, spatial analysis, and visualization rather than minute technical details.</w:t>
+      </w:r>
+    </w:p>
+    <w:p>
+      <w:pPr>
+        <w:numPr>
+          <w:ilvl w:val="0"/>
+          <w:numId w:val="2"/>
+        </w:numPr>
+      </w:pPr>
+      <w:r>
+        <w:rPr>
+          <w:b/>
+          <w:bCs/>
+        </w:rPr>
+        <w:t>Results:</w:t>
+      </w:r>
+      <w:r>
+        <w:t> Present your main findings, outputs, and spatial observations clearly.</w:t>
+      </w:r>
+    </w:p>
+    <w:p>
+      <w:pPr>
+        <w:numPr>
+          <w:ilvl w:val="0"/>
+          <w:numId w:val="2"/>
+        </w:numPr>
+      </w:pPr>
+      <w:r>
+        <w:rPr>
+          <w:b/>
+          <w:bCs/>
+        </w:rPr>
+        <w:lastRenderedPageBreak/>
+        <w:t>Challenges and Reflection:</w:t>
+      </w:r>
+      <w:r>
+        <w:t> Discuss at least one meaningful technical or analytical challenge you encountered. Describe how you dealt with it and what you learned from the debugging or redesign process.</w:t>
+      </w:r>
+    </w:p>
+    <w:p>
+      <w:pPr>
+        <w:numPr>
+          <w:ilvl w:val="0"/>
+          <w:numId w:val="2"/>
+        </w:numPr>
+      </w:pPr>
+      <w:r>
+        <w:rPr>
+          <w:b/>
+          <w:bCs/>
+        </w:rPr>
+        <w:t>Repository Link &amp; AI Statement:</w:t>
+      </w:r>
+      <w:r>
+        <w:t> You </w:t>
+      </w:r>
+      <w:r>
+        <w:rPr>
+          <w:i/>
+          <w:iCs/>
+        </w:rPr>
+        <w:t>must</w:t>
+      </w:r>
+      <w:r>
+        <w:t> include the URL to your public GitHub/GitLab repository. If you used AI tools, you must also include a short disclosure statement (see Section 4).</w:t>
+      </w:r>
+    </w:p>
+    <w:p/>
     <w:sectPr>
       <w:pgSz w:w="11906" w:h="16838"/>
       <w:pgMar w:top="1440" w:right="1440" w:bottom="1440" w:left="1440" w:header="708" w:footer="708" w:gutter="0"/>
@@ -393,8 +508,160 @@
       </w:rPr>
     </w:lvl>
   </w:abstractNum>
+  <w:abstractNum w:abstractNumId="1" w15:restartNumberingAfterBreak="0">
+    <w:nsid w:val="529E2B8E"/>
+    <w:multiLevelType w:val="multilevel"/>
+    <w:tmpl w:val="3EF00D56"/>
+    <w:lvl w:ilvl="0">
+      <w:start w:val="1"/>
+      <w:numFmt w:val="bullet"/>
+      <w:lvlText w:val=""/>
+      <w:lvlJc w:val="left"/>
+      <w:pPr>
+        <w:tabs>
+          <w:tab w:val="num" w:pos="720"/>
+        </w:tabs>
+        <w:ind w:left="720" w:hanging="360"/>
+      </w:pPr>
+      <w:rPr>
+        <w:rFonts w:ascii="Symbol" w:hAnsi="Symbol" w:hint="default"/>
+        <w:sz w:val="20"/>
+      </w:rPr>
+    </w:lvl>
+    <w:lvl w:ilvl="1" w:tentative="1">
+      <w:start w:val="1"/>
+      <w:numFmt w:val="bullet"/>
+      <w:lvlText w:val=""/>
+      <w:lvlJc w:val="left"/>
+      <w:pPr>
+        <w:tabs>
+          <w:tab w:val="num" w:pos="1440"/>
+        </w:tabs>
+        <w:ind w:left="1440" w:hanging="360"/>
+      </w:pPr>
+      <w:rPr>
+        <w:rFonts w:ascii="Symbol" w:hAnsi="Symbol" w:hint="default"/>
+        <w:sz w:val="20"/>
+      </w:rPr>
+    </w:lvl>
+    <w:lvl w:ilvl="2" w:tentative="1">
+      <w:start w:val="1"/>
+      <w:numFmt w:val="bullet"/>
+      <w:lvlText w:val=""/>
+      <w:lvlJc w:val="left"/>
+      <w:pPr>
+        <w:tabs>
+          <w:tab w:val="num" w:pos="2160"/>
+        </w:tabs>
+        <w:ind w:left="2160" w:hanging="360"/>
+      </w:pPr>
+      <w:rPr>
+        <w:rFonts w:ascii="Symbol" w:hAnsi="Symbol" w:hint="default"/>
+        <w:sz w:val="20"/>
+      </w:rPr>
+    </w:lvl>
+    <w:lvl w:ilvl="3" w:tentative="1">
+      <w:start w:val="1"/>
+      <w:numFmt w:val="bullet"/>
+      <w:lvlText w:val=""/>
+      <w:lvlJc w:val="left"/>
+      <w:pPr>
+        <w:tabs>
+          <w:tab w:val="num" w:pos="2880"/>
+        </w:tabs>
+        <w:ind w:left="2880" w:hanging="360"/>
+      </w:pPr>
+      <w:rPr>
+        <w:rFonts w:ascii="Symbol" w:hAnsi="Symbol" w:hint="default"/>
+        <w:sz w:val="20"/>
+      </w:rPr>
+    </w:lvl>
+    <w:lvl w:ilvl="4" w:tentative="1">
+      <w:start w:val="1"/>
+      <w:numFmt w:val="bullet"/>
+      <w:lvlText w:val=""/>
+      <w:lvlJc w:val="left"/>
+      <w:pPr>
+        <w:tabs>
+          <w:tab w:val="num" w:pos="3600"/>
+        </w:tabs>
+        <w:ind w:left="3600" w:hanging="360"/>
+      </w:pPr>
+      <w:rPr>
+        <w:rFonts w:ascii="Symbol" w:hAnsi="Symbol" w:hint="default"/>
+        <w:sz w:val="20"/>
+      </w:rPr>
+    </w:lvl>
+    <w:lvl w:ilvl="5" w:tentative="1">
+      <w:start w:val="1"/>
+      <w:numFmt w:val="bullet"/>
+      <w:lvlText w:val=""/>
+      <w:lvlJc w:val="left"/>
+      <w:pPr>
+        <w:tabs>
+          <w:tab w:val="num" w:pos="4320"/>
+        </w:tabs>
+        <w:ind w:left="4320" w:hanging="360"/>
+      </w:pPr>
+      <w:rPr>
+        <w:rFonts w:ascii="Symbol" w:hAnsi="Symbol" w:hint="default"/>
+        <w:sz w:val="20"/>
+      </w:rPr>
+    </w:lvl>
+    <w:lvl w:ilvl="6" w:tentative="1">
+      <w:start w:val="1"/>
+      <w:numFmt w:val="bullet"/>
+      <w:lvlText w:val=""/>
+      <w:lvlJc w:val="left"/>
+      <w:pPr>
+        <w:tabs>
+          <w:tab w:val="num" w:pos="5040"/>
+        </w:tabs>
+        <w:ind w:left="5040" w:hanging="360"/>
+      </w:pPr>
+      <w:rPr>
+        <w:rFonts w:ascii="Symbol" w:hAnsi="Symbol" w:hint="default"/>
+        <w:sz w:val="20"/>
+      </w:rPr>
+    </w:lvl>
+    <w:lvl w:ilvl="7" w:tentative="1">
+      <w:start w:val="1"/>
+      <w:numFmt w:val="bullet"/>
+      <w:lvlText w:val=""/>
+      <w:lvlJc w:val="left"/>
+      <w:pPr>
+        <w:tabs>
+          <w:tab w:val="num" w:pos="5760"/>
+        </w:tabs>
+        <w:ind w:left="5760" w:hanging="360"/>
+      </w:pPr>
+      <w:rPr>
+        <w:rFonts w:ascii="Symbol" w:hAnsi="Symbol" w:hint="default"/>
+        <w:sz w:val="20"/>
+      </w:rPr>
+    </w:lvl>
+    <w:lvl w:ilvl="8" w:tentative="1">
+      <w:start w:val="1"/>
+      <w:numFmt w:val="bullet"/>
+      <w:lvlText w:val=""/>
+      <w:lvlJc w:val="left"/>
+      <w:pPr>
+        <w:tabs>
+          <w:tab w:val="num" w:pos="6480"/>
+        </w:tabs>
+        <w:ind w:left="6480" w:hanging="360"/>
+      </w:pPr>
+      <w:rPr>
+        <w:rFonts w:ascii="Symbol" w:hAnsi="Symbol" w:hint="default"/>
+        <w:sz w:val="20"/>
+      </w:rPr>
+    </w:lvl>
+  </w:abstractNum>
   <w:num w:numId="1" w16cid:durableId="1978224131">
     <w:abstractNumId w:val="0"/>
+  </w:num>
+  <w:num w:numId="2" w16cid:durableId="1868057004">
+    <w:abstractNumId w:val="1"/>
   </w:num>
 </w:numbering>
 </file>

</xml_diff>

<commit_message>
Updated outputs in workflow
</commit_message>
<xml_diff>
--- a/Outputs/Project Report.docx
+++ b/Outputs/Project Report.docx
@@ -21,40 +21,429 @@
     <w:p>
       <w:pPr>
         <w:rPr>
+          <w:b/>
+          <w:bCs/>
+        </w:rPr>
+      </w:pPr>
+      <w:r>
+        <w:rPr>
+          <w:b/>
+          <w:bCs/>
+        </w:rPr>
+        <w:t>Introduction</w:t>
+      </w:r>
+    </w:p>
+    <w:p>
+      <w:r>
+        <w:t xml:space="preserve">The chosen project topic for this assessment was the Wildfires Project, with a focus on Australia. </w:t>
+      </w:r>
+      <w:r>
+        <w:t>As t</w:t>
+      </w:r>
+      <w:r>
+        <w:t xml:space="preserve">here is near real time satellite data and an </w:t>
+      </w:r>
+      <w:r>
+        <w:t>API</w:t>
+      </w:r>
+      <w:r>
+        <w:t xml:space="preserve"> to request </w:t>
+      </w:r>
+      <w:r>
+        <w:t>said data,</w:t>
+      </w:r>
+      <w:r>
+        <w:t xml:space="preserve"> I wanted to focus </w:t>
+      </w:r>
+      <w:r>
+        <w:t xml:space="preserve">on accessing current </w:t>
+      </w:r>
+      <w:r>
+        <w:t xml:space="preserve">“semi-live” data. The aim of the analysis was to replicate a fire monitoring and alert system that would be able to be used by government agencies to </w:t>
+      </w:r>
+      <w:r>
+        <w:t xml:space="preserve">assist in rapidly responding to potential fires. </w:t>
+      </w:r>
+    </w:p>
+    <w:p>
+      <w:r>
+        <w:t xml:space="preserve">Specifically, I wanted to </w:t>
+      </w:r>
+      <w:r>
+        <w:t>answer</w:t>
+      </w:r>
+      <w:r>
+        <w:t xml:space="preserve"> </w:t>
+      </w:r>
+      <w:r>
+        <w:t xml:space="preserve">the following: </w:t>
+      </w:r>
+    </w:p>
+    <w:p>
+      <w:pPr>
+        <w:rPr>
           <w:i/>
           <w:iCs/>
         </w:rPr>
       </w:pPr>
       <w:r>
-        <w:t xml:space="preserve">Research Question: </w:t>
-      </w:r>
-      <w:r>
         <w:rPr>
           <w:i/>
           <w:iCs/>
         </w:rPr>
-        <w:t>Wh</w:t>
+        <w:t>W</w:t>
       </w:r>
       <w:r>
         <w:rPr>
           <w:i/>
           <w:iCs/>
         </w:rPr>
-        <w:t>ere</w:t>
+        <w:t>here are the potential fires in Australia, and wh</w:t>
       </w:r>
       <w:r>
         <w:rPr>
           <w:i/>
           <w:iCs/>
         </w:rPr>
-        <w:t xml:space="preserve"> are the most recent </w:t>
+        <w:t>ich fire service is best placed (i.e. closest) to deal with it</w:t>
       </w:r>
       <w:r>
         <w:rPr>
           <w:i/>
           <w:iCs/>
         </w:rPr>
-        <w:t>satellite detected fires in Australia?</w:t>
+        <w:t>?</w:t>
+      </w:r>
+    </w:p>
+    <w:p/>
+    <w:p>
+      <w:pPr>
+        <w:rPr>
+          <w:b/>
+          <w:bCs/>
+        </w:rPr>
+      </w:pPr>
+      <w:r>
+        <w:rPr>
+          <w:b/>
+          <w:bCs/>
+        </w:rPr>
+        <w:t>Workflow and Implementation</w:t>
+      </w:r>
+    </w:p>
+    <w:p>
+      <w:r>
+        <w:t xml:space="preserve">The rough workflow that I started the project with developed into something more </w:t>
+      </w:r>
+      <w:r>
+        <w:t xml:space="preserve">detailed and with further elements as the project progressed. </w:t>
+      </w:r>
+    </w:p>
+    <w:p>
+      <w:pPr>
+        <w:rPr>
+          <w:rFonts w:ascii="Times New Roman" w:eastAsia="Times New Roman" w:hAnsi="Times New Roman" w:cs="Times New Roman"/>
+          <w:kern w:val="0"/>
+          <w:lang w:eastAsia="en-AU"/>
+          <w14:ligatures w14:val="none"/>
+        </w:rPr>
+      </w:pPr>
+      <w:r>
+        <w:rPr>
+          <w:rFonts w:ascii="Times New Roman" w:eastAsia="Times New Roman" w:hAnsi="Times New Roman" w:cs="Times New Roman"/>
+          <w:kern w:val="0"/>
+          <w:lang w:eastAsia="en-AU"/>
+          <w14:ligatures w14:val="none"/>
+        </w:rPr>
+        <w:t>The initial workflow looked like this as I had it sketched out.</w:t>
+      </w:r>
+    </w:p>
+    <w:p>
+      <w:r>
+        <w:drawing>
+          <wp:inline distT="0" distB="0" distL="0" distR="0" wp14:anchorId="1355F6C0" wp14:editId="1CC405AF">
+            <wp:extent cx="5274310" cy="1830173"/>
+            <wp:effectExtent l="0" t="0" r="2540" b="0"/>
+            <wp:docPr id="1725994392" name="Picture 1"/>
+            <wp:cNvGraphicFramePr>
+              <a:graphicFrameLocks xmlns:a="http://schemas.openxmlformats.org/drawingml/2006/main" noChangeAspect="1"/>
+            </wp:cNvGraphicFramePr>
+            <a:graphic xmlns:a="http://schemas.openxmlformats.org/drawingml/2006/main">
+              <a:graphicData uri="http://schemas.openxmlformats.org/drawingml/2006/picture">
+                <pic:pic xmlns:pic="http://schemas.openxmlformats.org/drawingml/2006/picture">
+                  <pic:nvPicPr>
+                    <pic:cNvPr id="1725994392" name=""/>
+                    <pic:cNvPicPr/>
+                  </pic:nvPicPr>
+                  <pic:blipFill>
+                    <a:blip r:embed="rId7"/>
+                    <a:stretch>
+                      <a:fillRect/>
+                    </a:stretch>
+                  </pic:blipFill>
+                  <pic:spPr>
+                    <a:xfrm>
+                      <a:off x="0" y="0"/>
+                      <a:ext cx="5296798" cy="1837976"/>
+                    </a:xfrm>
+                    <a:prstGeom prst="rect">
+                      <a:avLst/>
+                    </a:prstGeom>
+                  </pic:spPr>
+                </pic:pic>
+              </a:graphicData>
+            </a:graphic>
+          </wp:inline>
+        </w:drawing>
+      </w:r>
+    </w:p>
+    <w:p>
+      <w:r>
+        <w:t xml:space="preserve">This then developed </w:t>
+      </w:r>
+      <w:r>
+        <w:t xml:space="preserve">further by adding in the choropleth map and the </w:t>
+      </w:r>
+      <w:r>
+        <w:t xml:space="preserve">identification of nearest Rural Fire Service (RFS) station. </w:t>
+      </w:r>
+    </w:p>
+    <w:p>
+      <w:r>
+        <w:t>The approach I had to data cleaning was</w:t>
+      </w:r>
+      <w:r>
+        <w:t xml:space="preserve"> perhaps</w:t>
+      </w:r>
+      <w:r>
+        <w:t>,</w:t>
+      </w:r>
+      <w:r>
+        <w:t xml:space="preserve"> in reflection</w:t>
+      </w:r>
+      <w:r>
+        <w:t>,</w:t>
+      </w:r>
+      <w:r>
+        <w:t xml:space="preserve"> rather </w:t>
+      </w:r>
+      <w:r>
+        <w:t>shortsighted</w:t>
+      </w:r>
+      <w:r>
+        <w:t>. The analysis and visualisation</w:t>
+      </w:r>
+      <w:r>
+        <w:t xml:space="preserve"> goals dictated the </w:t>
+      </w:r>
+      <w:r>
+        <w:t xml:space="preserve">data to be imported, and how it would be manipulated. </w:t>
+      </w:r>
+      <w:r>
+        <w:t xml:space="preserve">There may have been better ways to approach it in a more holistic manner from the beginning, rather than undertaking </w:t>
+      </w:r>
+      <w:r>
+        <w:t xml:space="preserve">it in a piecemeal fashion. As for the visualisation approach, it was fairly iterative, with the maps being made and then I would </w:t>
+      </w:r>
+      <w:r>
+        <w:t>perform numerous tweaks until I was able to confirm the output was desirable.</w:t>
+      </w:r>
+    </w:p>
+    <w:p/>
+    <w:p>
+      <w:pPr>
+        <w:rPr>
+          <w:b/>
+          <w:bCs/>
+        </w:rPr>
+      </w:pPr>
+      <w:r>
+        <w:rPr>
+          <w:b/>
+          <w:bCs/>
+        </w:rPr>
+        <w:lastRenderedPageBreak/>
+        <w:t>Results</w:t>
+      </w:r>
+    </w:p>
+    <w:p>
+      <w:r>
+        <w:t>The results of this</w:t>
+      </w:r>
+      <w:r>
+        <w:t xml:space="preserve"> project </w:t>
+      </w:r>
+      <w:r>
+        <w:t>were three dynamic objects, two maps and a</w:t>
+      </w:r>
+      <w:r>
+        <w:t xml:space="preserve"> </w:t>
+      </w:r>
+      <w:r>
+        <w:t xml:space="preserve">.html table. </w:t>
+      </w:r>
+      <w:r>
+        <w:t xml:space="preserve">The aim was to identify where recent satellite based fire detections were occurring, and </w:t>
+      </w:r>
+      <w:hyperlink r:id="rId8" w:history="1">
+        <w:r>
+          <w:rPr>
+            <w:rStyle w:val="Hyperlink"/>
+          </w:rPr>
+          <w:t>this interactive bushfire map</w:t>
+        </w:r>
+      </w:hyperlink>
+      <w:r>
+        <w:t xml:space="preserve"> allows users to </w:t>
+      </w:r>
+      <w:r>
+        <w:t xml:space="preserve">find locations and identify the confidence and time since detection. </w:t>
+      </w:r>
+      <w:hyperlink r:id="rId9" w:history="1">
+        <w:r>
+          <w:rPr>
+            <w:rStyle w:val="Hyperlink"/>
+          </w:rPr>
+          <w:t>This choropleth map</w:t>
+        </w:r>
+      </w:hyperlink>
+      <w:r>
+        <w:t xml:space="preserve"> shows the </w:t>
+      </w:r>
+      <w:r>
+        <w:t xml:space="preserve">number of fire detections per Local Government Area (LGA) in Australia, and </w:t>
+      </w:r>
+      <w:hyperlink r:id="rId10" w:history="1">
+        <w:r>
+          <w:rPr>
+            <w:rStyle w:val="Hyperlink"/>
+          </w:rPr>
+          <w:t>https://liamedgeworth.github.io/Wildfires_SDS210/Outputs/first_rfs_response_3hrs.html</w:t>
+        </w:r>
+      </w:hyperlink>
+      <w:r>
+        <w:t xml:space="preserve"> </w:t>
+      </w:r>
+    </w:p>
+    <w:p/>
+    <w:p>
+      <w:pPr>
+        <w:numPr>
+          <w:ilvl w:val="0"/>
+          <w:numId w:val="2"/>
+        </w:numPr>
+      </w:pPr>
+      <w:r>
+        <w:rPr>
+          <w:b/>
+          <w:bCs/>
+        </w:rPr>
+        <w:t>Introduction:</w:t>
+      </w:r>
+      <w:r>
+        <w:t> Briefly explain your chosen project topic, the specific spatial question you are answering, and the ultimate aim of the analysis.</w:t>
+      </w:r>
+    </w:p>
+    <w:p>
+      <w:pPr>
+        <w:numPr>
+          <w:ilvl w:val="0"/>
+          <w:numId w:val="2"/>
+        </w:numPr>
+      </w:pPr>
+      <w:r>
+        <w:rPr>
+          <w:b/>
+          <w:bCs/>
+        </w:rPr>
+        <w:t>Workflow and Implementation:</w:t>
+      </w:r>
+      <w:r>
+        <w:t> Summarize the logical steps of your workflow. Focus on your overarching approach to data cleaning, spatial analysis, and visualization rather than minute technical details.</w:t>
+      </w:r>
+    </w:p>
+    <w:p>
+      <w:pPr>
+        <w:numPr>
+          <w:ilvl w:val="0"/>
+          <w:numId w:val="2"/>
+        </w:numPr>
+      </w:pPr>
+      <w:r>
+        <w:rPr>
+          <w:b/>
+          <w:bCs/>
+        </w:rPr>
+        <w:t>Results:</w:t>
+      </w:r>
+      <w:r>
+        <w:t> Present your main findings, outputs, and spatial observations clearly.</w:t>
+      </w:r>
+    </w:p>
+    <w:p>
+      <w:pPr>
+        <w:numPr>
+          <w:ilvl w:val="0"/>
+          <w:numId w:val="2"/>
+        </w:numPr>
+      </w:pPr>
+      <w:r>
+        <w:rPr>
+          <w:b/>
+          <w:bCs/>
+        </w:rPr>
+        <w:t>Challenges and Reflection:</w:t>
+      </w:r>
+      <w:r>
+        <w:t> Discuss at least one meaningful technical or analytical challenge you encountered. Describe how you dealt with it and what you learned from the debugging or redesign process.</w:t>
+      </w:r>
+    </w:p>
+    <w:p>
+      <w:pPr>
+        <w:numPr>
+          <w:ilvl w:val="0"/>
+          <w:numId w:val="2"/>
+        </w:numPr>
+      </w:pPr>
+      <w:r>
+        <w:rPr>
+          <w:b/>
+          <w:bCs/>
+        </w:rPr>
+        <w:t>Repository Link &amp; AI Statement:</w:t>
+      </w:r>
+      <w:r>
+        <w:t> You </w:t>
+      </w:r>
+      <w:r>
+        <w:rPr>
+          <w:i/>
+          <w:iCs/>
+        </w:rPr>
+        <w:t>must</w:t>
+      </w:r>
+      <w:r>
+        <w:t> include the URL to your public GitHub/GitLab repository. If you used AI tools, you must also include a short disclosure statement (see Section 4).</w:t>
+      </w:r>
+    </w:p>
+    <w:p/>
+    <w:p/>
+    <w:p>
+      <w:pPr>
+        <w:rPr>
+          <w:i/>
+          <w:iCs/>
+        </w:rPr>
+      </w:pPr>
+      <w:r>
+        <w:t xml:space="preserve">Research Question: </w:t>
+      </w:r>
+      <w:r>
+        <w:rPr>
+          <w:i/>
+          <w:iCs/>
+        </w:rPr>
+        <w:t>Where are the most recent satellite detected fires in Australia?</w:t>
       </w:r>
     </w:p>
     <w:p>
@@ -108,10 +497,7 @@
         </w:numPr>
       </w:pPr>
       <w:r>
-        <w:t xml:space="preserve">Size of included data </w:t>
-      </w:r>
-      <w:r>
-        <w:t xml:space="preserve">can really slow down project, </w:t>
+        <w:t xml:space="preserve">Size of included data can really slow down project, </w:t>
       </w:r>
       <w:proofErr w:type="spellStart"/>
       <w:r>
@@ -131,10 +517,7 @@
         </w:numPr>
       </w:pPr>
       <w:r>
-        <w:t xml:space="preserve">Refreshing of script so that the maps stay </w:t>
-      </w:r>
-      <w:r>
-        <w:t>relevant</w:t>
+        <w:t>Refreshing of script so that the maps stay relevant</w:t>
       </w:r>
     </w:p>
     <w:p>
@@ -152,8 +535,9 @@
         <w:rPr>
           <w:noProof/>
         </w:rPr>
+        <w:lastRenderedPageBreak/>
         <w:drawing>
-          <wp:inline distT="0" distB="0" distL="0" distR="0" wp14:anchorId="03A36834" wp14:editId="2EE13955">
+          <wp:inline distT="0" distB="0" distL="0" distR="0" wp14:anchorId="6B06AD71" wp14:editId="7A38A868">
             <wp:extent cx="5706271" cy="724001"/>
             <wp:effectExtent l="0" t="0" r="8890" b="0"/>
             <wp:docPr id="1985552084" name="Picture 1"/>
@@ -168,7 +552,7 @@
                     <pic:cNvPicPr/>
                   </pic:nvPicPr>
                   <pic:blipFill>
-                    <a:blip r:embed="rId7"/>
+                    <a:blip r:embed="rId11"/>
                     <a:stretch>
                       <a:fillRect/>
                     </a:stretch>
@@ -191,149 +575,6 @@
     </w:p>
     <w:p/>
     <w:p/>
-    <w:p/>
-    <w:p>
-      <w:hyperlink r:id="rId8" w:history="1">
-        <w:r>
-          <w:rPr>
-            <w:rStyle w:val="Hyperlink"/>
-          </w:rPr>
-          <w:t>Australia Bushfire Map</w:t>
-        </w:r>
-      </w:hyperlink>
-    </w:p>
-    <w:p>
-      <w:hyperlink r:id="rId9" w:history="1">
-        <w:r>
-          <w:rPr>
-            <w:rStyle w:val="Hyperlink"/>
-          </w:rPr>
-          <w:t>Bushfire Choropleth Map</w:t>
-        </w:r>
-      </w:hyperlink>
-    </w:p>
-    <w:p>
-      <w:hyperlink r:id="rId10" w:history="1">
-        <w:r>
-          <w:rPr>
-            <w:rStyle w:val="Hyperlink"/>
-          </w:rPr>
-          <w:t>Fire Detections within the last three hours</w:t>
-        </w:r>
-      </w:hyperlink>
-    </w:p>
-    <w:p/>
-    <w:p/>
-    <w:p>
-      <w:pPr>
-        <w:numPr>
-          <w:ilvl w:val="0"/>
-          <w:numId w:val="2"/>
-        </w:numPr>
-      </w:pPr>
-      <w:r>
-        <w:rPr>
-          <w:b/>
-          <w:bCs/>
-        </w:rPr>
-        <w:t>Introduction:</w:t>
-      </w:r>
-      <w:r>
-        <w:t xml:space="preserve"> Briefly explain your chosen project topic, the specific spatial question you are answering, and the </w:t>
-      </w:r>
-      <w:proofErr w:type="gramStart"/>
-      <w:r>
-        <w:t>ultimate aim</w:t>
-      </w:r>
-      <w:proofErr w:type="gramEnd"/>
-      <w:r>
-        <w:t xml:space="preserve"> of the analysis.</w:t>
-      </w:r>
-    </w:p>
-    <w:p>
-      <w:pPr>
-        <w:numPr>
-          <w:ilvl w:val="0"/>
-          <w:numId w:val="2"/>
-        </w:numPr>
-      </w:pPr>
-      <w:r>
-        <w:rPr>
-          <w:b/>
-          <w:bCs/>
-        </w:rPr>
-        <w:t>Workflow and Implementation:</w:t>
-      </w:r>
-      <w:r>
-        <w:t> Summarize the logical steps of your workflow. Focus on your overarching approach to data cleaning, spatial analysis, and visualization rather than minute technical details.</w:t>
-      </w:r>
-    </w:p>
-    <w:p>
-      <w:pPr>
-        <w:numPr>
-          <w:ilvl w:val="0"/>
-          <w:numId w:val="2"/>
-        </w:numPr>
-      </w:pPr>
-      <w:r>
-        <w:rPr>
-          <w:b/>
-          <w:bCs/>
-        </w:rPr>
-        <w:t>Results:</w:t>
-      </w:r>
-      <w:r>
-        <w:t> Present your main findings, outputs, and spatial observations clearly.</w:t>
-      </w:r>
-    </w:p>
-    <w:p>
-      <w:pPr>
-        <w:numPr>
-          <w:ilvl w:val="0"/>
-          <w:numId w:val="2"/>
-        </w:numPr>
-      </w:pPr>
-      <w:r>
-        <w:rPr>
-          <w:b/>
-          <w:bCs/>
-        </w:rPr>
-        <w:lastRenderedPageBreak/>
-        <w:t>Challenges and Reflection:</w:t>
-      </w:r>
-      <w:r>
-        <w:t> Discuss at least one meaningful technical or analytical challenge you encountered. Describe how you dealt with it and what you learned from the debugging or redesign process.</w:t>
-      </w:r>
-    </w:p>
-    <w:p>
-      <w:pPr>
-        <w:numPr>
-          <w:ilvl w:val="0"/>
-          <w:numId w:val="2"/>
-        </w:numPr>
-      </w:pPr>
-      <w:r>
-        <w:rPr>
-          <w:b/>
-          <w:bCs/>
-        </w:rPr>
-        <w:t>Repository Link &amp; AI Statement:</w:t>
-      </w:r>
-      <w:r>
-        <w:t> You </w:t>
-      </w:r>
-      <w:r>
-        <w:rPr>
-          <w:i/>
-          <w:iCs/>
-        </w:rPr>
-        <w:t>must</w:t>
-      </w:r>
-      <w:r>
-        <w:t> include the URL to your public GitHub/GitLab repository. If you used AI tools, you must also include a short disclosure statement (see Section 4).</w:t>
-      </w:r>
-    </w:p>
-    <w:p/>
     <w:sectPr>
       <w:pgSz w:w="11906" w:h="16838"/>
       <w:pgMar w:top="1440" w:right="1440" w:bottom="1440" w:left="1440" w:header="708" w:footer="708" w:gutter="0"/>
@@ -509,6 +750,204 @@
     </w:lvl>
   </w:abstractNum>
   <w:abstractNum w:abstractNumId="1" w15:restartNumberingAfterBreak="0">
+    <w:nsid w:val="2B2D0CDC"/>
+    <w:multiLevelType w:val="hybridMultilevel"/>
+    <w:tmpl w:val="D9C29238"/>
+    <w:lvl w:ilvl="0" w:tplc="0C090001">
+      <w:numFmt w:val="bullet"/>
+      <w:lvlText w:val=""/>
+      <w:lvlJc w:val="left"/>
+      <w:pPr>
+        <w:ind w:left="720" w:hanging="360"/>
+      </w:pPr>
+      <w:rPr>
+        <w:rFonts w:ascii="Symbol" w:eastAsia="Times New Roman" w:hAnsi="Symbol" w:cs="Times New Roman" w:hint="default"/>
+      </w:rPr>
+    </w:lvl>
+    <w:lvl w:ilvl="1" w:tplc="0C090003" w:tentative="1">
+      <w:start w:val="1"/>
+      <w:numFmt w:val="bullet"/>
+      <w:lvlText w:val="o"/>
+      <w:lvlJc w:val="left"/>
+      <w:pPr>
+        <w:ind w:left="1440" w:hanging="360"/>
+      </w:pPr>
+      <w:rPr>
+        <w:rFonts w:ascii="Courier New" w:hAnsi="Courier New" w:cs="Courier New" w:hint="default"/>
+      </w:rPr>
+    </w:lvl>
+    <w:lvl w:ilvl="2" w:tplc="0C090005" w:tentative="1">
+      <w:start w:val="1"/>
+      <w:numFmt w:val="bullet"/>
+      <w:lvlText w:val=""/>
+      <w:lvlJc w:val="left"/>
+      <w:pPr>
+        <w:ind w:left="2160" w:hanging="360"/>
+      </w:pPr>
+      <w:rPr>
+        <w:rFonts w:ascii="Wingdings" w:hAnsi="Wingdings" w:hint="default"/>
+      </w:rPr>
+    </w:lvl>
+    <w:lvl w:ilvl="3" w:tplc="0C090001" w:tentative="1">
+      <w:start w:val="1"/>
+      <w:numFmt w:val="bullet"/>
+      <w:lvlText w:val=""/>
+      <w:lvlJc w:val="left"/>
+      <w:pPr>
+        <w:ind w:left="2880" w:hanging="360"/>
+      </w:pPr>
+      <w:rPr>
+        <w:rFonts w:ascii="Symbol" w:hAnsi="Symbol" w:hint="default"/>
+      </w:rPr>
+    </w:lvl>
+    <w:lvl w:ilvl="4" w:tplc="0C090003" w:tentative="1">
+      <w:start w:val="1"/>
+      <w:numFmt w:val="bullet"/>
+      <w:lvlText w:val="o"/>
+      <w:lvlJc w:val="left"/>
+      <w:pPr>
+        <w:ind w:left="3600" w:hanging="360"/>
+      </w:pPr>
+      <w:rPr>
+        <w:rFonts w:ascii="Courier New" w:hAnsi="Courier New" w:cs="Courier New" w:hint="default"/>
+      </w:rPr>
+    </w:lvl>
+    <w:lvl w:ilvl="5" w:tplc="0C090005" w:tentative="1">
+      <w:start w:val="1"/>
+      <w:numFmt w:val="bullet"/>
+      <w:lvlText w:val=""/>
+      <w:lvlJc w:val="left"/>
+      <w:pPr>
+        <w:ind w:left="4320" w:hanging="360"/>
+      </w:pPr>
+      <w:rPr>
+        <w:rFonts w:ascii="Wingdings" w:hAnsi="Wingdings" w:hint="default"/>
+      </w:rPr>
+    </w:lvl>
+    <w:lvl w:ilvl="6" w:tplc="0C090001" w:tentative="1">
+      <w:start w:val="1"/>
+      <w:numFmt w:val="bullet"/>
+      <w:lvlText w:val=""/>
+      <w:lvlJc w:val="left"/>
+      <w:pPr>
+        <w:ind w:left="5040" w:hanging="360"/>
+      </w:pPr>
+      <w:rPr>
+        <w:rFonts w:ascii="Symbol" w:hAnsi="Symbol" w:hint="default"/>
+      </w:rPr>
+    </w:lvl>
+    <w:lvl w:ilvl="7" w:tplc="0C090003" w:tentative="1">
+      <w:start w:val="1"/>
+      <w:numFmt w:val="bullet"/>
+      <w:lvlText w:val="o"/>
+      <w:lvlJc w:val="left"/>
+      <w:pPr>
+        <w:ind w:left="5760" w:hanging="360"/>
+      </w:pPr>
+      <w:rPr>
+        <w:rFonts w:ascii="Courier New" w:hAnsi="Courier New" w:cs="Courier New" w:hint="default"/>
+      </w:rPr>
+    </w:lvl>
+    <w:lvl w:ilvl="8" w:tplc="0C090005" w:tentative="1">
+      <w:start w:val="1"/>
+      <w:numFmt w:val="bullet"/>
+      <w:lvlText w:val=""/>
+      <w:lvlJc w:val="left"/>
+      <w:pPr>
+        <w:ind w:left="6480" w:hanging="360"/>
+      </w:pPr>
+      <w:rPr>
+        <w:rFonts w:ascii="Wingdings" w:hAnsi="Wingdings" w:hint="default"/>
+      </w:rPr>
+    </w:lvl>
+  </w:abstractNum>
+  <w:abstractNum w:abstractNumId="2" w15:restartNumberingAfterBreak="0">
+    <w:nsid w:val="347820E5"/>
+    <w:multiLevelType w:val="hybridMultilevel"/>
+    <w:tmpl w:val="738A0A9E"/>
+    <w:lvl w:ilvl="0" w:tplc="0C09000F">
+      <w:start w:val="1"/>
+      <w:numFmt w:val="decimal"/>
+      <w:lvlText w:val="%1."/>
+      <w:lvlJc w:val="left"/>
+      <w:pPr>
+        <w:ind w:left="720" w:hanging="360"/>
+      </w:pPr>
+    </w:lvl>
+    <w:lvl w:ilvl="1" w:tplc="0C090019">
+      <w:start w:val="1"/>
+      <w:numFmt w:val="lowerLetter"/>
+      <w:lvlText w:val="%2."/>
+      <w:lvlJc w:val="left"/>
+      <w:pPr>
+        <w:ind w:left="1440" w:hanging="360"/>
+      </w:pPr>
+    </w:lvl>
+    <w:lvl w:ilvl="2" w:tplc="0C09001B" w:tentative="1">
+      <w:start w:val="1"/>
+      <w:numFmt w:val="lowerRoman"/>
+      <w:lvlText w:val="%3."/>
+      <w:lvlJc w:val="right"/>
+      <w:pPr>
+        <w:ind w:left="2160" w:hanging="180"/>
+      </w:pPr>
+    </w:lvl>
+    <w:lvl w:ilvl="3" w:tplc="0C09000F" w:tentative="1">
+      <w:start w:val="1"/>
+      <w:numFmt w:val="decimal"/>
+      <w:lvlText w:val="%4."/>
+      <w:lvlJc w:val="left"/>
+      <w:pPr>
+        <w:ind w:left="2880" w:hanging="360"/>
+      </w:pPr>
+    </w:lvl>
+    <w:lvl w:ilvl="4" w:tplc="0C090019" w:tentative="1">
+      <w:start w:val="1"/>
+      <w:numFmt w:val="lowerLetter"/>
+      <w:lvlText w:val="%5."/>
+      <w:lvlJc w:val="left"/>
+      <w:pPr>
+        <w:ind w:left="3600" w:hanging="360"/>
+      </w:pPr>
+    </w:lvl>
+    <w:lvl w:ilvl="5" w:tplc="0C09001B" w:tentative="1">
+      <w:start w:val="1"/>
+      <w:numFmt w:val="lowerRoman"/>
+      <w:lvlText w:val="%6."/>
+      <w:lvlJc w:val="right"/>
+      <w:pPr>
+        <w:ind w:left="4320" w:hanging="180"/>
+      </w:pPr>
+    </w:lvl>
+    <w:lvl w:ilvl="6" w:tplc="0C09000F" w:tentative="1">
+      <w:start w:val="1"/>
+      <w:numFmt w:val="decimal"/>
+      <w:lvlText w:val="%7."/>
+      <w:lvlJc w:val="left"/>
+      <w:pPr>
+        <w:ind w:left="5040" w:hanging="360"/>
+      </w:pPr>
+    </w:lvl>
+    <w:lvl w:ilvl="7" w:tplc="0C090019" w:tentative="1">
+      <w:start w:val="1"/>
+      <w:numFmt w:val="lowerLetter"/>
+      <w:lvlText w:val="%8."/>
+      <w:lvlJc w:val="left"/>
+      <w:pPr>
+        <w:ind w:left="5760" w:hanging="360"/>
+      </w:pPr>
+    </w:lvl>
+    <w:lvl w:ilvl="8" w:tplc="0C09001B" w:tentative="1">
+      <w:start w:val="1"/>
+      <w:numFmt w:val="lowerRoman"/>
+      <w:lvlText w:val="%9."/>
+      <w:lvlJc w:val="right"/>
+      <w:pPr>
+        <w:ind w:left="6480" w:hanging="180"/>
+      </w:pPr>
+    </w:lvl>
+  </w:abstractNum>
+  <w:abstractNum w:abstractNumId="3" w15:restartNumberingAfterBreak="0">
     <w:nsid w:val="529E2B8E"/>
     <w:multiLevelType w:val="multilevel"/>
     <w:tmpl w:val="3EF00D56"/>
@@ -653,6 +1092,155 @@
       </w:pPr>
       <w:rPr>
         <w:rFonts w:ascii="Symbol" w:hAnsi="Symbol" w:hint="default"/>
+        <w:sz w:val="20"/>
+      </w:rPr>
+    </w:lvl>
+  </w:abstractNum>
+  <w:abstractNum w:abstractNumId="4" w15:restartNumberingAfterBreak="0">
+    <w:nsid w:val="64112839"/>
+    <w:multiLevelType w:val="multilevel"/>
+    <w:tmpl w:val="86B2FC44"/>
+    <w:lvl w:ilvl="0">
+      <w:start w:val="1"/>
+      <w:numFmt w:val="bullet"/>
+      <w:lvlText w:val=""/>
+      <w:lvlJc w:val="left"/>
+      <w:pPr>
+        <w:tabs>
+          <w:tab w:val="num" w:pos="720"/>
+        </w:tabs>
+        <w:ind w:left="720" w:hanging="360"/>
+      </w:pPr>
+      <w:rPr>
+        <w:rFonts w:ascii="Symbol" w:hAnsi="Symbol" w:hint="default"/>
+        <w:sz w:val="20"/>
+      </w:rPr>
+    </w:lvl>
+    <w:lvl w:ilvl="1" w:tentative="1">
+      <w:start w:val="1"/>
+      <w:numFmt w:val="bullet"/>
+      <w:lvlText w:val="o"/>
+      <w:lvlJc w:val="left"/>
+      <w:pPr>
+        <w:tabs>
+          <w:tab w:val="num" w:pos="1440"/>
+        </w:tabs>
+        <w:ind w:left="1440" w:hanging="360"/>
+      </w:pPr>
+      <w:rPr>
+        <w:rFonts w:ascii="Courier New" w:hAnsi="Courier New" w:hint="default"/>
+        <w:sz w:val="20"/>
+      </w:rPr>
+    </w:lvl>
+    <w:lvl w:ilvl="2" w:tentative="1">
+      <w:start w:val="1"/>
+      <w:numFmt w:val="bullet"/>
+      <w:lvlText w:val=""/>
+      <w:lvlJc w:val="left"/>
+      <w:pPr>
+        <w:tabs>
+          <w:tab w:val="num" w:pos="2160"/>
+        </w:tabs>
+        <w:ind w:left="2160" w:hanging="360"/>
+      </w:pPr>
+      <w:rPr>
+        <w:rFonts w:ascii="Wingdings" w:hAnsi="Wingdings" w:hint="default"/>
+        <w:sz w:val="20"/>
+      </w:rPr>
+    </w:lvl>
+    <w:lvl w:ilvl="3" w:tentative="1">
+      <w:start w:val="1"/>
+      <w:numFmt w:val="bullet"/>
+      <w:lvlText w:val=""/>
+      <w:lvlJc w:val="left"/>
+      <w:pPr>
+        <w:tabs>
+          <w:tab w:val="num" w:pos="2880"/>
+        </w:tabs>
+        <w:ind w:left="2880" w:hanging="360"/>
+      </w:pPr>
+      <w:rPr>
+        <w:rFonts w:ascii="Wingdings" w:hAnsi="Wingdings" w:hint="default"/>
+        <w:sz w:val="20"/>
+      </w:rPr>
+    </w:lvl>
+    <w:lvl w:ilvl="4" w:tentative="1">
+      <w:start w:val="1"/>
+      <w:numFmt w:val="bullet"/>
+      <w:lvlText w:val=""/>
+      <w:lvlJc w:val="left"/>
+      <w:pPr>
+        <w:tabs>
+          <w:tab w:val="num" w:pos="3600"/>
+        </w:tabs>
+        <w:ind w:left="3600" w:hanging="360"/>
+      </w:pPr>
+      <w:rPr>
+        <w:rFonts w:ascii="Wingdings" w:hAnsi="Wingdings" w:hint="default"/>
+        <w:sz w:val="20"/>
+      </w:rPr>
+    </w:lvl>
+    <w:lvl w:ilvl="5" w:tentative="1">
+      <w:start w:val="1"/>
+      <w:numFmt w:val="bullet"/>
+      <w:lvlText w:val=""/>
+      <w:lvlJc w:val="left"/>
+      <w:pPr>
+        <w:tabs>
+          <w:tab w:val="num" w:pos="4320"/>
+        </w:tabs>
+        <w:ind w:left="4320" w:hanging="360"/>
+      </w:pPr>
+      <w:rPr>
+        <w:rFonts w:ascii="Wingdings" w:hAnsi="Wingdings" w:hint="default"/>
+        <w:sz w:val="20"/>
+      </w:rPr>
+    </w:lvl>
+    <w:lvl w:ilvl="6" w:tentative="1">
+      <w:start w:val="1"/>
+      <w:numFmt w:val="bullet"/>
+      <w:lvlText w:val=""/>
+      <w:lvlJc w:val="left"/>
+      <w:pPr>
+        <w:tabs>
+          <w:tab w:val="num" w:pos="5040"/>
+        </w:tabs>
+        <w:ind w:left="5040" w:hanging="360"/>
+      </w:pPr>
+      <w:rPr>
+        <w:rFonts w:ascii="Wingdings" w:hAnsi="Wingdings" w:hint="default"/>
+        <w:sz w:val="20"/>
+      </w:rPr>
+    </w:lvl>
+    <w:lvl w:ilvl="7" w:tentative="1">
+      <w:start w:val="1"/>
+      <w:numFmt w:val="bullet"/>
+      <w:lvlText w:val=""/>
+      <w:lvlJc w:val="left"/>
+      <w:pPr>
+        <w:tabs>
+          <w:tab w:val="num" w:pos="5760"/>
+        </w:tabs>
+        <w:ind w:left="5760" w:hanging="360"/>
+      </w:pPr>
+      <w:rPr>
+        <w:rFonts w:ascii="Wingdings" w:hAnsi="Wingdings" w:hint="default"/>
+        <w:sz w:val="20"/>
+      </w:rPr>
+    </w:lvl>
+    <w:lvl w:ilvl="8" w:tentative="1">
+      <w:start w:val="1"/>
+      <w:numFmt w:val="bullet"/>
+      <w:lvlText w:val=""/>
+      <w:lvlJc w:val="left"/>
+      <w:pPr>
+        <w:tabs>
+          <w:tab w:val="num" w:pos="6480"/>
+        </w:tabs>
+        <w:ind w:left="6480" w:hanging="360"/>
+      </w:pPr>
+      <w:rPr>
+        <w:rFonts w:ascii="Wingdings" w:hAnsi="Wingdings" w:hint="default"/>
         <w:sz w:val="20"/>
       </w:rPr>
     </w:lvl>
@@ -661,6 +1249,15 @@
     <w:abstractNumId w:val="0"/>
   </w:num>
   <w:num w:numId="2" w16cid:durableId="1868057004">
+    <w:abstractNumId w:val="3"/>
+  </w:num>
+  <w:num w:numId="3" w16cid:durableId="1011224813">
+    <w:abstractNumId w:val="4"/>
+  </w:num>
+  <w:num w:numId="4" w16cid:durableId="534659934">
+    <w:abstractNumId w:val="2"/>
+  </w:num>
+  <w:num w:numId="5" w16cid:durableId="1004094007">
     <w:abstractNumId w:val="1"/>
   </w:num>
 </w:numbering>

</xml_diff>

<commit_message>
Fire detections by LGA
Replaced clunky copy pasted code with a for loop
</commit_message>
<xml_diff>
--- a/Outputs/Project Report.docx
+++ b/Outputs/Project Report.docx
@@ -197,7 +197,25 @@
           <w:sz w:val="20"/>
           <w:szCs w:val="20"/>
         </w:rPr>
-        <w:t>here are the potential fires in Australia, and wh</w:t>
+        <w:t>here are the fire</w:t>
+      </w:r>
+      <w:r>
+        <w:rPr>
+          <w:i/>
+          <w:iCs/>
+          <w:sz w:val="20"/>
+          <w:szCs w:val="20"/>
+        </w:rPr>
+        <w:t xml:space="preserve"> detections</w:t>
+      </w:r>
+      <w:r>
+        <w:rPr>
+          <w:i/>
+          <w:iCs/>
+          <w:sz w:val="20"/>
+          <w:szCs w:val="20"/>
+        </w:rPr>
+        <w:t xml:space="preserve"> in Australia, and wh</w:t>
       </w:r>
       <w:r>
         <w:rPr>
@@ -643,7 +661,21 @@
           <w:sz w:val="20"/>
           <w:szCs w:val="20"/>
         </w:rPr>
-        <w:t xml:space="preserve"> shows a life update of fire detections within the last three </w:t>
+        <w:t xml:space="preserve"> shows a li</w:t>
+      </w:r>
+      <w:r>
+        <w:rPr>
+          <w:sz w:val="20"/>
+          <w:szCs w:val="20"/>
+        </w:rPr>
+        <w:t>v</w:t>
+      </w:r>
+      <w:r>
+        <w:rPr>
+          <w:sz w:val="20"/>
+          <w:szCs w:val="20"/>
+        </w:rPr>
+        <w:t xml:space="preserve">e update of fire detections within the last three </w:t>
       </w:r>
       <w:r>
         <w:rPr>
@@ -688,7 +720,21 @@
           <w:sz w:val="20"/>
           <w:szCs w:val="20"/>
         </w:rPr>
-        <w:t xml:space="preserve">refreshed. Stagnant data is a demonstration that the </w:t>
+        <w:t xml:space="preserve">refreshed. Stagnant data </w:t>
+      </w:r>
+      <w:r>
+        <w:rPr>
+          <w:sz w:val="20"/>
+          <w:szCs w:val="20"/>
+        </w:rPr>
+        <w:t xml:space="preserve">means </w:t>
+      </w:r>
+      <w:r>
+        <w:rPr>
+          <w:sz w:val="20"/>
+          <w:szCs w:val="20"/>
+        </w:rPr>
+        <w:t xml:space="preserve">that the </w:t>
       </w:r>
       <w:r>
         <w:rPr>
@@ -750,7 +796,21 @@
           <w:sz w:val="20"/>
           <w:szCs w:val="20"/>
         </w:rPr>
-        <w:t xml:space="preserve">the combination of </w:t>
+        <w:t xml:space="preserve">the </w:t>
+      </w:r>
+      <w:r>
+        <w:rPr>
+          <w:sz w:val="20"/>
+          <w:szCs w:val="20"/>
+        </w:rPr>
+        <w:t xml:space="preserve">successful </w:t>
+      </w:r>
+      <w:r>
+        <w:rPr>
+          <w:sz w:val="20"/>
+          <w:szCs w:val="20"/>
+        </w:rPr>
+        <w:t xml:space="preserve">combination of </w:t>
       </w:r>
       <w:proofErr w:type="gramStart"/>
       <w:r>
@@ -787,7 +847,21 @@
           <w:sz w:val="20"/>
           <w:szCs w:val="20"/>
         </w:rPr>
-        <w:t>combine for much more complex tasks. There were undoubtedly challenges that arose during the process</w:t>
+        <w:t xml:space="preserve">combine for much more complex tasks. There were </w:t>
+      </w:r>
+      <w:r>
+        <w:rPr>
+          <w:sz w:val="20"/>
+          <w:szCs w:val="20"/>
+        </w:rPr>
+        <w:t>of course</w:t>
+      </w:r>
+      <w:r>
+        <w:rPr>
+          <w:sz w:val="20"/>
+          <w:szCs w:val="20"/>
+        </w:rPr>
+        <w:t xml:space="preserve"> challenges that arose during the process</w:t>
       </w:r>
       <w:r>
         <w:rPr>
@@ -840,6 +914,16 @@
           <w:u w:val="single"/>
         </w:rPr>
         <w:t>”</w:t>
+      </w:r>
+      <w:r>
+        <w:rPr>
+          <w:i/>
+          <w:iCs/>
+          <w:sz w:val="20"/>
+          <w:szCs w:val="20"/>
+          <w:u w:val="single"/>
+        </w:rPr>
+        <w:t xml:space="preserve"> (code block 5)</w:t>
       </w:r>
     </w:p>
     <w:p>
@@ -1251,7 +1335,28 @@
           <w:sz w:val="20"/>
           <w:szCs w:val="20"/>
         </w:rPr>
-        <w:t xml:space="preserve">I spent way too much time trying to get </w:t>
+        <w:t>T</w:t>
+      </w:r>
+      <w:r>
+        <w:rPr>
+          <w:sz w:val="20"/>
+          <w:szCs w:val="20"/>
+        </w:rPr>
+        <w:t xml:space="preserve">oo much time </w:t>
+      </w:r>
+      <w:r>
+        <w:rPr>
+          <w:sz w:val="20"/>
+          <w:szCs w:val="20"/>
+        </w:rPr>
+        <w:t xml:space="preserve">was spent </w:t>
+      </w:r>
+      <w:r>
+        <w:rPr>
+          <w:sz w:val="20"/>
+          <w:szCs w:val="20"/>
+        </w:rPr>
+        <w:t xml:space="preserve">trying to get </w:t>
       </w:r>
       <w:r>
         <w:rPr>
@@ -1324,7 +1429,7 @@
           <w:sz w:val="20"/>
           <w:szCs w:val="20"/>
         </w:rPr>
-        <w:t>and was constantly getting them confused. Never again.</w:t>
+        <w:t xml:space="preserve">and was constantly getting them confused. </w:t>
       </w:r>
     </w:p>
     <w:p>

</xml_diff>